<commit_message>
docs: add hardware platform chapter (board selection, boot, connections)
</commit_message>
<xml_diff>
--- a/docs/ZYNQ-OFDM基带系统-保姆级实施手册.docx
+++ b/docs/ZYNQ-OFDM基带系统-保姆级实施手册.docx
@@ -735,7 +735,7 @@
             <w:spacing w:before="120" w:after="60"/>
           </w:pPr>
           <w:r>
-            <w:t>第5章  Vivado 搭建步骤（照着点）</w:t>
+            <w:t>第5章  硬件平台搭建：选板、启动与连接（照着接）</w:t>
           </w:r>
           <w:r>
             <w:tab/>
@@ -754,7 +754,7 @@
             <w:spacing w:before="120" w:after="60"/>
           </w:pPr>
           <w:r>
-            <w:t>5.2  坑</w:t>
+            <w:t>5.1  板卡选型（本项目只需最低配置）</w:t>
           </w:r>
           <w:r>
             <w:tab/>
@@ -765,14 +765,34 @@
         </w:p>
         <w:p>
           <w:pPr>
-            <w:pStyle w:val="TOC1"/>
+            <w:pStyle w:val="TOC2"/>
+            <w:ind w:left="360"/>
             <w:tabs>
               <w:tab w:val="right" w:leader="dot" w:pos="9026"/>
             </w:tabs>
             <w:spacing w:before="120" w:after="60"/>
           </w:pPr>
           <w:r>
-            <w:t>第6章  PS Linux 与 PC：BER 统计与曲线绘制</w:t>
+            <w:t>5.2  连接拓扑（三线到位）</w:t>
+          </w:r>
+          <w:r>
+            <w:tab/>
+          </w:r>
+          <w:r>
+            <w:t>17</w:t>
+          </w:r>
+        </w:p>
+        <w:p>
+          <w:pPr>
+            <w:pStyle w:val="TOC2"/>
+            <w:ind w:left="360"/>
+            <w:tabs>
+              <w:tab w:val="right" w:leader="dot" w:pos="9026"/>
+            </w:tabs>
+            <w:spacing w:before="120" w:after="60"/>
+          </w:pPr>
+          <w:r>
+            <w:t>5.3  启动流程（PYNQ-Z2 为例，照着做）</w:t>
           </w:r>
           <w:r>
             <w:tab/>
@@ -791,7 +811,25 @@
             <w:spacing w:before="120" w:after="60"/>
           </w:pPr>
           <w:r>
-            <w:t>6.1  寄存器映射与访问（/dev/uio0）</w:t>
+            <w:t>5.4  硬件坑</w:t>
+          </w:r>
+          <w:r>
+            <w:tab/>
+          </w:r>
+          <w:r>
+            <w:t>18</w:t>
+          </w:r>
+        </w:p>
+        <w:p>
+          <w:pPr>
+            <w:pStyle w:val="TOC1"/>
+            <w:tabs>
+              <w:tab w:val="right" w:leader="dot" w:pos="9026"/>
+            </w:tabs>
+            <w:spacing w:before="120" w:after="60"/>
+          </w:pPr>
+          <w:r>
+            <w:t>第6章  Vivado 搭建步骤（照着点）</w:t>
           </w:r>
           <w:r>
             <w:tab/>
@@ -810,13 +848,31 @@
             <w:spacing w:before="120" w:after="60"/>
           </w:pPr>
           <w:r>
-            <w:t>6.2  SNR 扫描闭环</w:t>
+            <w:t>6.2  坑</w:t>
           </w:r>
           <w:r>
             <w:tab/>
           </w:r>
           <w:r>
-            <w:t>20</w:t>
+            <w:t>19</w:t>
+          </w:r>
+        </w:p>
+        <w:p>
+          <w:pPr>
+            <w:pStyle w:val="TOC1"/>
+            <w:tabs>
+              <w:tab w:val="right" w:leader="dot" w:pos="9026"/>
+            </w:tabs>
+            <w:spacing w:before="120" w:after="60"/>
+          </w:pPr>
+          <w:r>
+            <w:t>第7章  PS Linux 与 PC：BER 统计与曲线绘制</w:t>
+          </w:r>
+          <w:r>
+            <w:tab/>
+          </w:r>
+          <w:r>
+            <w:t>19</w:t>
           </w:r>
         </w:p>
         <w:p>
@@ -829,13 +885,51 @@
             <w:spacing w:before="120" w:after="60"/>
           </w:pPr>
           <w:r>
-            <w:t>6.3  坑</w:t>
+            <w:t>7.1  寄存器映射与访问（/dev/uio0）</w:t>
+          </w:r>
+          <w:r>
+            <w:tab/>
+          </w:r>
+          <w:r>
+            <w:t>19</w:t>
+          </w:r>
+        </w:p>
+        <w:p>
+          <w:pPr>
+            <w:pStyle w:val="TOC2"/>
+            <w:ind w:left="360"/>
+            <w:tabs>
+              <w:tab w:val="right" w:leader="dot" w:pos="9026"/>
+            </w:tabs>
+            <w:spacing w:before="120" w:after="60"/>
+          </w:pPr>
+          <w:r>
+            <w:t>7.2  SNR 扫描闭环</w:t>
           </w:r>
           <w:r>
             <w:tab/>
           </w:r>
           <w:r>
             <w:t>21</w:t>
+          </w:r>
+        </w:p>
+        <w:p>
+          <w:pPr>
+            <w:pStyle w:val="TOC2"/>
+            <w:ind w:left="360"/>
+            <w:tabs>
+              <w:tab w:val="right" w:leader="dot" w:pos="9026"/>
+            </w:tabs>
+            <w:spacing w:before="120" w:after="60"/>
+          </w:pPr>
+          <w:r>
+            <w:t>7.3  坑</w:t>
+          </w:r>
+          <w:r>
+            <w:tab/>
+          </w:r>
+          <w:r>
+            <w:t>22</w:t>
           </w:r>
         </w:p>
         <w:p>
@@ -847,13 +941,13 @@
             <w:spacing w:before="120" w:after="60"/>
           </w:pPr>
           <w:r>
-            <w:t>第7章  理论与答辩问答（8问）</w:t>
+            <w:t>第8章  理论与答辩问答（8问）</w:t>
           </w:r>
           <w:r>
             <w:tab/>
           </w:r>
           <w:r>
-            <w:t>21</w:t>
+            <w:t>23</w:t>
           </w:r>
         </w:p>
         <w:p>
@@ -871,7 +965,7 @@
             <w:tab/>
           </w:r>
           <w:r>
-            <w:t>23</w:t>
+            <w:t>24</w:t>
           </w:r>
         </w:p>
         <w:p>
@@ -15421,9 +15515,28 @@
           <w:sz w:val="32"/>
           <w:szCs w:val="32"/>
         </w:rPr>
-        <w:t xml:space="preserve">第5章  Vivado 搭建步骤（照着点）</w:t>
+        <w:t xml:space="preserve">第5章  硬件平台搭建：选板、启动与连接（照着接）</w:t>
       </w:r>
       <w:bookmarkEnd w:id="21"/>
+    </w:p>
+    <w:p>
+      <w:pPr>
+        <w:pStyle w:val="Heading2"/>
+        <w:spacing w:after="140" w:before="300" w:line="340" w:lineRule="atLeast"/>
+      </w:pPr>
+      <w:bookmarkStart w:name="_Toc22" w:id="22"/>
+      <w:r>
+        <w:rPr>
+          <w:rFonts w:ascii="Times New Roman" w:eastAsia="SimHei"/>
+          <w:b/>
+          <w:bCs/>
+          <w:color w:val="0E2230"/>
+          <w:sz w:val="30"/>
+          <w:szCs w:val="30"/>
+        </w:rPr>
+        <w:t xml:space="preserve">5.1  板卡选型（本项目只需最低配置）</w:t>
+      </w:r>
+      <w:bookmarkEnd w:id="22"/>
     </w:p>
     <w:p>
       <w:pPr>
@@ -15440,7 +15553,1326 @@
           <w:sz w:val="21"/>
           <w:szCs w:val="21"/>
         </w:rPr>
-        <w:t xml:space="preserve">表5-1  工程搭建清单</w:t>
+        <w:t xml:space="preserve">表5-1  ZYNQ板卡选型对比</w:t>
+      </w:r>
+    </w:p>
+    <w:tbl>
+      <w:tblPr>
+        <w:tblW w:type="pct" w:w="5000"/>
+        <w:tblBorders>
+          <w:top w:val="single" w:color="1B6B7A" w:sz="6"/>
+          <w:left w:val="none" w:color="FFFFFF" w:sz="0"/>
+          <w:bottom w:val="single" w:color="1B6B7A" w:sz="6"/>
+          <w:right w:val="none" w:color="FFFFFF" w:sz="0"/>
+          <w:insideH w:val="single" w:color="C8DDE2" w:sz="2"/>
+          <w:insideV w:val="none" w:color="FFFFFF" w:sz="0"/>
+        </w:tblBorders>
+      </w:tblPr>
+      <w:tblGrid>
+        <w:gridCol w:w="1933"/>
+        <w:gridCol w:w="1230"/>
+        <w:gridCol w:w="1230"/>
+        <w:gridCol w:w="4394"/>
+      </w:tblGrid>
+      <w:tr>
+        <w:trPr>
+          <w:cantSplit/>
+          <w:tblHeader/>
+        </w:trPr>
+        <w:tc>
+          <w:tcPr>
+            <w:tcW w:type="pct" w:w="1100"/>
+            <w:shd w:fill="1B6B7A" w:val="clear"/>
+            <w:tcMar>
+              <w:top w:type="dxa" w:w="60"/>
+              <w:left w:type="dxa" w:w="100"/>
+              <w:bottom w:type="dxa" w:w="60"/>
+              <w:right w:type="dxa" w:w="100"/>
+            </w:tcMar>
+            <w:vAlign w:val="center"/>
+          </w:tcPr>
+          <w:p>
+            <w:pPr>
+              <w:spacing w:line="280"/>
+              <w:jc w:val="center"/>
+            </w:pPr>
+            <w:r>
+              <w:rPr>
+                <w:rFonts w:ascii="Times New Roman" w:eastAsia="SimHei"/>
+                <w:b/>
+                <w:bCs/>
+                <w:color w:val="FFFFFF"/>
+                <w:sz w:val="21"/>
+                <w:szCs w:val="21"/>
+              </w:rPr>
+              <w:t xml:space="preserve">板卡</w:t>
+            </w:r>
+          </w:p>
+        </w:tc>
+        <w:tc>
+          <w:tcPr>
+            <w:tcW w:type="pct" w:w="700"/>
+            <w:shd w:fill="1B6B7A" w:val="clear"/>
+            <w:tcMar>
+              <w:top w:type="dxa" w:w="60"/>
+              <w:left w:type="dxa" w:w="100"/>
+              <w:bottom w:type="dxa" w:w="60"/>
+              <w:right w:type="dxa" w:w="100"/>
+            </w:tcMar>
+            <w:vAlign w:val="center"/>
+          </w:tcPr>
+          <w:p>
+            <w:pPr>
+              <w:spacing w:line="280"/>
+              <w:jc w:val="center"/>
+            </w:pPr>
+            <w:r>
+              <w:rPr>
+                <w:rFonts w:ascii="Times New Roman" w:eastAsia="SimHei"/>
+                <w:b/>
+                <w:bCs/>
+                <w:color w:val="FFFFFF"/>
+                <w:sz w:val="21"/>
+                <w:szCs w:val="21"/>
+              </w:rPr>
+              <w:t xml:space="preserve">价格</w:t>
+            </w:r>
+          </w:p>
+        </w:tc>
+        <w:tc>
+          <w:tcPr>
+            <w:tcW w:type="pct" w:w="700"/>
+            <w:shd w:fill="1B6B7A" w:val="clear"/>
+            <w:tcMar>
+              <w:top w:type="dxa" w:w="60"/>
+              <w:left w:type="dxa" w:w="100"/>
+              <w:bottom w:type="dxa" w:w="60"/>
+              <w:right w:type="dxa" w:w="100"/>
+            </w:tcMar>
+            <w:vAlign w:val="center"/>
+          </w:tcPr>
+          <w:p>
+            <w:pPr>
+              <w:spacing w:line="280"/>
+              <w:jc w:val="center"/>
+            </w:pPr>
+            <w:r>
+              <w:rPr>
+                <w:rFonts w:ascii="Times New Roman" w:eastAsia="SimHei"/>
+                <w:b/>
+                <w:bCs/>
+                <w:color w:val="FFFFFF"/>
+                <w:sz w:val="21"/>
+                <w:szCs w:val="21"/>
+              </w:rPr>
+              <w:t xml:space="preserve">芯片</w:t>
+            </w:r>
+          </w:p>
+        </w:tc>
+        <w:tc>
+          <w:tcPr>
+            <w:tcW w:type="pct" w:w="2500"/>
+            <w:shd w:fill="1B6B7A" w:val="clear"/>
+            <w:tcMar>
+              <w:top w:type="dxa" w:w="60"/>
+              <w:left w:type="dxa" w:w="100"/>
+              <w:bottom w:type="dxa" w:w="60"/>
+              <w:right w:type="dxa" w:w="100"/>
+            </w:tcMar>
+            <w:vAlign w:val="center"/>
+          </w:tcPr>
+          <w:p>
+            <w:pPr>
+              <w:spacing w:line="280"/>
+              <w:jc w:val="center"/>
+            </w:pPr>
+            <w:r>
+              <w:rPr>
+                <w:rFonts w:ascii="Times New Roman" w:eastAsia="SimHei"/>
+                <w:b/>
+                <w:bCs/>
+                <w:color w:val="FFFFFF"/>
+                <w:sz w:val="21"/>
+                <w:szCs w:val="21"/>
+              </w:rPr>
+              <w:t xml:space="preserve">说明</w:t>
+            </w:r>
+          </w:p>
+        </w:tc>
+      </w:tr>
+      <w:tr>
+        <w:trPr>
+          <w:cantSplit/>
+        </w:trPr>
+        <w:tc>
+          <w:tcPr>
+            <w:tcW w:type="pct" w:w="1100"/>
+            <w:shd w:fill="FFFFFF" w:val="clear"/>
+            <w:tcMar>
+              <w:top w:type="dxa" w:w="50"/>
+              <w:left w:type="dxa" w:w="100"/>
+              <w:bottom w:type="dxa" w:w="50"/>
+              <w:right w:type="dxa" w:w="100"/>
+            </w:tcMar>
+          </w:tcPr>
+          <w:p>
+            <w:pPr>
+              <w:spacing w:after="20" w:before="20" w:line="280"/>
+              <w:jc w:val="left"/>
+            </w:pPr>
+            <w:r>
+              <w:rPr>
+                <w:rFonts w:ascii="Times New Roman" w:eastAsia="SimSun"/>
+                <w:b w:val="false"/>
+                <w:bCs w:val="false"/>
+                <w:color w:val="000000"/>
+                <w:sz w:val="21"/>
+                <w:szCs w:val="21"/>
+              </w:rPr>
+              <w:t xml:space="preserve">PYNQ-Z2（推荐）</w:t>
+            </w:r>
+          </w:p>
+        </w:tc>
+        <w:tc>
+          <w:tcPr>
+            <w:tcW w:type="pct" w:w="700"/>
+            <w:shd w:fill="FFFFFF" w:val="clear"/>
+            <w:tcMar>
+              <w:top w:type="dxa" w:w="50"/>
+              <w:left w:type="dxa" w:w="100"/>
+              <w:bottom w:type="dxa" w:w="50"/>
+              <w:right w:type="dxa" w:w="100"/>
+            </w:tcMar>
+          </w:tcPr>
+          <w:p>
+            <w:pPr>
+              <w:spacing w:after="20" w:before="20" w:line="280"/>
+              <w:jc w:val="left"/>
+            </w:pPr>
+            <w:r>
+              <w:rPr>
+                <w:rFonts w:ascii="Times New Roman" w:eastAsia="SimSun"/>
+                <w:b w:val="false"/>
+                <w:bCs w:val="false"/>
+                <w:color w:val="000000"/>
+                <w:sz w:val="21"/>
+                <w:szCs w:val="21"/>
+              </w:rPr>
+              <w:t xml:space="preserve">¥1200~1500</w:t>
+            </w:r>
+          </w:p>
+        </w:tc>
+        <w:tc>
+          <w:tcPr>
+            <w:tcW w:type="pct" w:w="700"/>
+            <w:shd w:fill="FFFFFF" w:val="clear"/>
+            <w:tcMar>
+              <w:top w:type="dxa" w:w="50"/>
+              <w:left w:type="dxa" w:w="100"/>
+              <w:bottom w:type="dxa" w:w="50"/>
+              <w:right w:type="dxa" w:w="100"/>
+            </w:tcMar>
+          </w:tcPr>
+          <w:p>
+            <w:pPr>
+              <w:spacing w:after="20" w:before="20" w:line="280"/>
+              <w:jc w:val="left"/>
+            </w:pPr>
+            <w:r>
+              <w:rPr>
+                <w:rFonts w:ascii="Times New Roman" w:eastAsia="SimSun"/>
+                <w:b w:val="false"/>
+                <w:bCs w:val="false"/>
+                <w:color w:val="000000"/>
+                <w:sz w:val="21"/>
+                <w:szCs w:val="21"/>
+              </w:rPr>
+              <w:t xml:space="preserve">Z7020</w:t>
+            </w:r>
+          </w:p>
+        </w:tc>
+        <w:tc>
+          <w:tcPr>
+            <w:tcW w:type="pct" w:w="2500"/>
+            <w:shd w:fill="FFFFFF" w:val="clear"/>
+            <w:tcMar>
+              <w:top w:type="dxa" w:w="50"/>
+              <w:left w:type="dxa" w:w="100"/>
+              <w:bottom w:type="dxa" w:w="50"/>
+              <w:right w:type="dxa" w:w="100"/>
+            </w:tcMar>
+          </w:tcPr>
+          <w:p>
+            <w:pPr>
+              <w:spacing w:after="20" w:before="20" w:line="280"/>
+              <w:jc w:val="left"/>
+            </w:pPr>
+            <w:r>
+              <w:rPr>
+                <w:rFonts w:ascii="Times New Roman" w:eastAsia="SimSun"/>
+                <w:b w:val="false"/>
+                <w:bCs w:val="false"/>
+                <w:color w:val="000000"/>
+                <w:sz w:val="21"/>
+                <w:szCs w:val="21"/>
+              </w:rPr>
+              <w:t xml:space="preserve">官方镜像开箱即用, SD/网口/串口齐全, 教程最多</w:t>
+            </w:r>
+          </w:p>
+        </w:tc>
+      </w:tr>
+      <w:tr>
+        <w:trPr>
+          <w:cantSplit/>
+        </w:trPr>
+        <w:tc>
+          <w:tcPr>
+            <w:tcW w:type="pct" w:w="1100"/>
+            <w:shd w:fill="EDF3F5" w:val="clear"/>
+            <w:tcMar>
+              <w:top w:type="dxa" w:w="50"/>
+              <w:left w:type="dxa" w:w="100"/>
+              <w:bottom w:type="dxa" w:w="50"/>
+              <w:right w:type="dxa" w:w="100"/>
+            </w:tcMar>
+          </w:tcPr>
+          <w:p>
+            <w:pPr>
+              <w:spacing w:after="20" w:before="20" w:line="280"/>
+              <w:jc w:val="left"/>
+            </w:pPr>
+            <w:r>
+              <w:rPr>
+                <w:rFonts w:ascii="Times New Roman" w:eastAsia="SimSun"/>
+                <w:b w:val="false"/>
+                <w:bCs w:val="false"/>
+                <w:color w:val="000000"/>
+                <w:sz w:val="21"/>
+                <w:szCs w:val="21"/>
+              </w:rPr>
+              <w:t xml:space="preserve">EBAZ4205 矿渣板</w:t>
+            </w:r>
+          </w:p>
+        </w:tc>
+        <w:tc>
+          <w:tcPr>
+            <w:tcW w:type="pct" w:w="700"/>
+            <w:shd w:fill="EDF3F5" w:val="clear"/>
+            <w:tcMar>
+              <w:top w:type="dxa" w:w="50"/>
+              <w:left w:type="dxa" w:w="100"/>
+              <w:bottom w:type="dxa" w:w="50"/>
+              <w:right w:type="dxa" w:w="100"/>
+            </w:tcMar>
+          </w:tcPr>
+          <w:p>
+            <w:pPr>
+              <w:spacing w:after="20" w:before="20" w:line="280"/>
+              <w:jc w:val="left"/>
+            </w:pPr>
+            <w:r>
+              <w:rPr>
+                <w:rFonts w:ascii="Times New Roman" w:eastAsia="SimSun"/>
+                <w:b w:val="false"/>
+                <w:bCs w:val="false"/>
+                <w:color w:val="000000"/>
+                <w:sz w:val="21"/>
+                <w:szCs w:val="21"/>
+              </w:rPr>
+              <w:t xml:space="preserve">¥60~100</w:t>
+            </w:r>
+          </w:p>
+        </w:tc>
+        <w:tc>
+          <w:tcPr>
+            <w:tcW w:type="pct" w:w="700"/>
+            <w:shd w:fill="EDF3F5" w:val="clear"/>
+            <w:tcMar>
+              <w:top w:type="dxa" w:w="50"/>
+              <w:left w:type="dxa" w:w="100"/>
+              <w:bottom w:type="dxa" w:w="50"/>
+              <w:right w:type="dxa" w:w="100"/>
+            </w:tcMar>
+          </w:tcPr>
+          <w:p>
+            <w:pPr>
+              <w:spacing w:after="20" w:before="20" w:line="280"/>
+              <w:jc w:val="left"/>
+            </w:pPr>
+            <w:r>
+              <w:rPr>
+                <w:rFonts w:ascii="Times New Roman" w:eastAsia="SimSun"/>
+                <w:b w:val="false"/>
+                <w:bCs w:val="false"/>
+                <w:color w:val="000000"/>
+                <w:sz w:val="21"/>
+                <w:szCs w:val="21"/>
+              </w:rPr>
+              <w:t xml:space="preserve">Z7010</w:t>
+            </w:r>
+          </w:p>
+        </w:tc>
+        <w:tc>
+          <w:tcPr>
+            <w:tcW w:type="pct" w:w="2500"/>
+            <w:shd w:fill="EDF3F5" w:val="clear"/>
+            <w:tcMar>
+              <w:top w:type="dxa" w:w="50"/>
+              <w:left w:type="dxa" w:w="100"/>
+              <w:bottom w:type="dxa" w:w="50"/>
+              <w:right w:type="dxa" w:w="100"/>
+            </w:tcMar>
+          </w:tcPr>
+          <w:p>
+            <w:pPr>
+              <w:spacing w:after="20" w:before="20" w:line="280"/>
+              <w:jc w:val="left"/>
+            </w:pPr>
+            <w:r>
+              <w:rPr>
+                <w:rFonts w:ascii="Times New Roman" w:eastAsia="SimSun"/>
+                <w:b w:val="false"/>
+                <w:bCs w:val="false"/>
+                <w:color w:val="000000"/>
+                <w:sz w:val="21"/>
+                <w:szCs w:val="21"/>
+              </w:rPr>
+              <w:t xml:space="preserve">矿机拆机板, 极限预算神器: 需自己焊SD卡座/串口, 资料少但完全够本项目</w:t>
+            </w:r>
+          </w:p>
+        </w:tc>
+      </w:tr>
+      <w:tr>
+        <w:trPr>
+          <w:cantSplit/>
+        </w:trPr>
+        <w:tc>
+          <w:tcPr>
+            <w:tcW w:type="pct" w:w="1100"/>
+            <w:shd w:fill="FFFFFF" w:val="clear"/>
+            <w:tcMar>
+              <w:top w:type="dxa" w:w="50"/>
+              <w:left w:type="dxa" w:w="100"/>
+              <w:bottom w:type="dxa" w:w="50"/>
+              <w:right w:type="dxa" w:w="100"/>
+            </w:tcMar>
+          </w:tcPr>
+          <w:p>
+            <w:pPr>
+              <w:spacing w:after="20" w:before="20" w:line="280"/>
+              <w:jc w:val="left"/>
+            </w:pPr>
+            <w:r>
+              <w:rPr>
+                <w:rFonts w:ascii="Times New Roman" w:eastAsia="SimSun"/>
+                <w:b w:val="false"/>
+                <w:bCs w:val="false"/>
+                <w:color w:val="000000"/>
+                <w:sz w:val="21"/>
+                <w:szCs w:val="21"/>
+              </w:rPr>
+              <w:t xml:space="preserve">正点原子/ALINX</w:t>
+            </w:r>
+          </w:p>
+        </w:tc>
+        <w:tc>
+          <w:tcPr>
+            <w:tcW w:type="pct" w:w="700"/>
+            <w:shd w:fill="FFFFFF" w:val="clear"/>
+            <w:tcMar>
+              <w:top w:type="dxa" w:w="50"/>
+              <w:left w:type="dxa" w:w="100"/>
+              <w:bottom w:type="dxa" w:w="50"/>
+              <w:right w:type="dxa" w:w="100"/>
+            </w:tcMar>
+          </w:tcPr>
+          <w:p>
+            <w:pPr>
+              <w:spacing w:after="20" w:before="20" w:line="280"/>
+              <w:jc w:val="left"/>
+            </w:pPr>
+            <w:r>
+              <w:rPr>
+                <w:rFonts w:ascii="Times New Roman" w:eastAsia="SimSun"/>
+                <w:b w:val="false"/>
+                <w:bCs w:val="false"/>
+                <w:color w:val="000000"/>
+                <w:sz w:val="21"/>
+                <w:szCs w:val="21"/>
+              </w:rPr>
+              <w:t xml:space="preserve">¥800+</w:t>
+            </w:r>
+          </w:p>
+        </w:tc>
+        <w:tc>
+          <w:tcPr>
+            <w:tcW w:type="pct" w:w="700"/>
+            <w:shd w:fill="FFFFFF" w:val="clear"/>
+            <w:tcMar>
+              <w:top w:type="dxa" w:w="50"/>
+              <w:left w:type="dxa" w:w="100"/>
+              <w:bottom w:type="dxa" w:w="50"/>
+              <w:right w:type="dxa" w:w="100"/>
+            </w:tcMar>
+          </w:tcPr>
+          <w:p>
+            <w:pPr>
+              <w:spacing w:after="20" w:before="20" w:line="280"/>
+              <w:jc w:val="left"/>
+            </w:pPr>
+            <w:r>
+              <w:rPr>
+                <w:rFonts w:ascii="Times New Roman" w:eastAsia="SimSun"/>
+                <w:b w:val="false"/>
+                <w:bCs w:val="false"/>
+                <w:color w:val="000000"/>
+                <w:sz w:val="21"/>
+                <w:szCs w:val="21"/>
+              </w:rPr>
+              <w:t xml:space="preserve">Z7010/20</w:t>
+            </w:r>
+          </w:p>
+        </w:tc>
+        <w:tc>
+          <w:tcPr>
+            <w:tcW w:type="pct" w:w="2500"/>
+            <w:shd w:fill="FFFFFF" w:val="clear"/>
+            <w:tcMar>
+              <w:top w:type="dxa" w:w="50"/>
+              <w:left w:type="dxa" w:w="100"/>
+              <w:bottom w:type="dxa" w:w="50"/>
+              <w:right w:type="dxa" w:w="100"/>
+            </w:tcMar>
+          </w:tcPr>
+          <w:p>
+            <w:pPr>
+              <w:spacing w:after="20" w:before="20" w:line="280"/>
+              <w:jc w:val="left"/>
+            </w:pPr>
+            <w:r>
+              <w:rPr>
+                <w:rFonts w:ascii="Times New Roman" w:eastAsia="SimSun"/>
+                <w:b w:val="false"/>
+                <w:bCs w:val="false"/>
+                <w:color w:val="000000"/>
+                <w:sz w:val="21"/>
+                <w:szCs w:val="21"/>
+              </w:rPr>
+              <w:t xml:space="preserve">资料中文齐全, 售后好</w:t>
+            </w:r>
+          </w:p>
+        </w:tc>
+      </w:tr>
+    </w:tbl>
+    <w:p>
+      <w:pPr>
+        <w:spacing w:after="100"/>
+      </w:pPr>
+    </w:p>
+    <w:p>
+      <w:pPr>
+        <w:spacing w:after="60" w:line="312"/>
+        <w:ind w:firstLine="480"/>
+        <w:jc w:val="both"/>
+      </w:pPr>
+      <w:r>
+        <w:rPr>
+          <w:rFonts w:ascii="Times New Roman" w:eastAsia="SimSun"/>
+          <w:color w:val="000000"/>
+          <w:sz w:val="24"/>
+          <w:szCs w:val="24"/>
+        </w:rPr>
+        <w:t xml:space="preserve">本项目全数字闭环，对外只需：网口（TCP上报）+ 串口（控制台）+ JTAG（下载）。任何 ZYNQ 7000 板都能跑；性价比首选 EBAZ4205，省心首选 PYNQ-Z2。</w:t>
+      </w:r>
+    </w:p>
+    <w:p>
+      <w:pPr>
+        <w:pStyle w:val="Heading2"/>
+        <w:spacing w:after="140" w:before="300" w:line="340" w:lineRule="atLeast"/>
+      </w:pPr>
+      <w:bookmarkStart w:name="_Toc23" w:id="23"/>
+      <w:r>
+        <w:rPr>
+          <w:rFonts w:ascii="Times New Roman" w:eastAsia="SimHei"/>
+          <w:b/>
+          <w:bCs/>
+          <w:color w:val="0E2230"/>
+          <w:sz w:val="30"/>
+          <w:szCs w:val="30"/>
+        </w:rPr>
+        <w:t xml:space="preserve">5.2  连接拓扑（三线到位）</w:t>
+      </w:r>
+      <w:bookmarkEnd w:id="23"/>
+    </w:p>
+    <w:p>
+      <w:pPr>
+        <w:keepNext/>
+        <w:spacing w:after="80" w:before="160"/>
+        <w:jc w:val="center"/>
+      </w:pPr>
+      <w:r>
+        <w:rPr>
+          <w:rFonts w:ascii="Times New Roman" w:eastAsia="SimHei"/>
+          <w:b/>
+          <w:bCs/>
+          <w:color w:val="0E2230"/>
+          <w:sz w:val="21"/>
+          <w:szCs w:val="21"/>
+        </w:rPr>
+        <w:t xml:space="preserve">表5-2  连接表</w:t>
+      </w:r>
+    </w:p>
+    <w:tbl>
+      <w:tblPr>
+        <w:tblW w:type="pct" w:w="5000"/>
+        <w:tblBorders>
+          <w:top w:val="single" w:color="1B6B7A" w:sz="6"/>
+          <w:left w:val="none" w:color="FFFFFF" w:sz="0"/>
+          <w:bottom w:val="single" w:color="1B6B7A" w:sz="6"/>
+          <w:right w:val="none" w:color="FFFFFF" w:sz="0"/>
+          <w:insideH w:val="single" w:color="C8DDE2" w:sz="2"/>
+          <w:insideV w:val="none" w:color="FFFFFF" w:sz="0"/>
+        </w:tblBorders>
+      </w:tblPr>
+      <w:tblGrid>
+        <w:gridCol w:w="2109"/>
+        <w:gridCol w:w="2285"/>
+        <w:gridCol w:w="4394"/>
+      </w:tblGrid>
+      <w:tr>
+        <w:trPr>
+          <w:cantSplit/>
+          <w:tblHeader/>
+        </w:trPr>
+        <w:tc>
+          <w:tcPr>
+            <w:tcW w:type="pct" w:w="1200"/>
+            <w:shd w:fill="1B6B7A" w:val="clear"/>
+            <w:tcMar>
+              <w:top w:type="dxa" w:w="60"/>
+              <w:left w:type="dxa" w:w="100"/>
+              <w:bottom w:type="dxa" w:w="60"/>
+              <w:right w:type="dxa" w:w="100"/>
+            </w:tcMar>
+            <w:vAlign w:val="center"/>
+          </w:tcPr>
+          <w:p>
+            <w:pPr>
+              <w:spacing w:line="280"/>
+              <w:jc w:val="center"/>
+            </w:pPr>
+            <w:r>
+              <w:rPr>
+                <w:rFonts w:ascii="Times New Roman" w:eastAsia="SimHei"/>
+                <w:b/>
+                <w:bCs/>
+                <w:color w:val="FFFFFF"/>
+                <w:sz w:val="21"/>
+                <w:szCs w:val="21"/>
+              </w:rPr>
+              <w:t xml:space="preserve">连接</w:t>
+            </w:r>
+          </w:p>
+        </w:tc>
+        <w:tc>
+          <w:tcPr>
+            <w:tcW w:type="pct" w:w="1300"/>
+            <w:shd w:fill="1B6B7A" w:val="clear"/>
+            <w:tcMar>
+              <w:top w:type="dxa" w:w="60"/>
+              <w:left w:type="dxa" w:w="100"/>
+              <w:bottom w:type="dxa" w:w="60"/>
+              <w:right w:type="dxa" w:w="100"/>
+            </w:tcMar>
+            <w:vAlign w:val="center"/>
+          </w:tcPr>
+          <w:p>
+            <w:pPr>
+              <w:spacing w:line="280"/>
+              <w:jc w:val="center"/>
+            </w:pPr>
+            <w:r>
+              <w:rPr>
+                <w:rFonts w:ascii="Times New Roman" w:eastAsia="SimHei"/>
+                <w:b/>
+                <w:bCs/>
+                <w:color w:val="FFFFFF"/>
+                <w:sz w:val="21"/>
+                <w:szCs w:val="21"/>
+              </w:rPr>
+              <w:t xml:space="preserve">线缆</w:t>
+            </w:r>
+          </w:p>
+        </w:tc>
+        <w:tc>
+          <w:tcPr>
+            <w:tcW w:type="pct" w:w="2500"/>
+            <w:shd w:fill="1B6B7A" w:val="clear"/>
+            <w:tcMar>
+              <w:top w:type="dxa" w:w="60"/>
+              <w:left w:type="dxa" w:w="100"/>
+              <w:bottom w:type="dxa" w:w="60"/>
+              <w:right w:type="dxa" w:w="100"/>
+            </w:tcMar>
+            <w:vAlign w:val="center"/>
+          </w:tcPr>
+          <w:p>
+            <w:pPr>
+              <w:spacing w:line="280"/>
+              <w:jc w:val="center"/>
+            </w:pPr>
+            <w:r>
+              <w:rPr>
+                <w:rFonts w:ascii="Times New Roman" w:eastAsia="SimHei"/>
+                <w:b/>
+                <w:bCs/>
+                <w:color w:val="FFFFFF"/>
+                <w:sz w:val="21"/>
+                <w:szCs w:val="21"/>
+              </w:rPr>
+              <w:t xml:space="preserve">作用</w:t>
+            </w:r>
+          </w:p>
+        </w:tc>
+      </w:tr>
+      <w:tr>
+        <w:trPr>
+          <w:cantSplit/>
+        </w:trPr>
+        <w:tc>
+          <w:tcPr>
+            <w:tcW w:type="pct" w:w="1200"/>
+            <w:shd w:fill="FFFFFF" w:val="clear"/>
+            <w:tcMar>
+              <w:top w:type="dxa" w:w="50"/>
+              <w:left w:type="dxa" w:w="100"/>
+              <w:bottom w:type="dxa" w:w="50"/>
+              <w:right w:type="dxa" w:w="100"/>
+            </w:tcMar>
+          </w:tcPr>
+          <w:p>
+            <w:pPr>
+              <w:spacing w:after="20" w:before="20" w:line="280"/>
+              <w:jc w:val="left"/>
+            </w:pPr>
+            <w:r>
+              <w:rPr>
+                <w:rFonts w:ascii="Times New Roman" w:eastAsia="SimSun"/>
+                <w:b w:val="false"/>
+                <w:bCs w:val="false"/>
+                <w:color w:val="000000"/>
+                <w:sz w:val="21"/>
+                <w:szCs w:val="21"/>
+              </w:rPr>
+              <w:t xml:space="preserve">PC ⇄ 板卡网口</w:t>
+            </w:r>
+          </w:p>
+        </w:tc>
+        <w:tc>
+          <w:tcPr>
+            <w:tcW w:type="pct" w:w="1300"/>
+            <w:shd w:fill="FFFFFF" w:val="clear"/>
+            <w:tcMar>
+              <w:top w:type="dxa" w:w="50"/>
+              <w:left w:type="dxa" w:w="100"/>
+              <w:bottom w:type="dxa" w:w="50"/>
+              <w:right w:type="dxa" w:w="100"/>
+            </w:tcMar>
+          </w:tcPr>
+          <w:p>
+            <w:pPr>
+              <w:spacing w:after="20" w:before="20" w:line="280"/>
+              <w:jc w:val="left"/>
+            </w:pPr>
+            <w:r>
+              <w:rPr>
+                <w:rFonts w:ascii="Times New Roman" w:eastAsia="SimSun"/>
+                <w:b w:val="false"/>
+                <w:bCs w:val="false"/>
+                <w:color w:val="000000"/>
+                <w:sz w:val="21"/>
+                <w:szCs w:val="21"/>
+              </w:rPr>
+              <w:t xml:space="preserve">网线（直连或同路由）</w:t>
+            </w:r>
+          </w:p>
+        </w:tc>
+        <w:tc>
+          <w:tcPr>
+            <w:tcW w:type="pct" w:w="2500"/>
+            <w:shd w:fill="FFFFFF" w:val="clear"/>
+            <w:tcMar>
+              <w:top w:type="dxa" w:w="50"/>
+              <w:left w:type="dxa" w:w="100"/>
+              <w:bottom w:type="dxa" w:w="50"/>
+              <w:right w:type="dxa" w:w="100"/>
+            </w:tcMar>
+          </w:tcPr>
+          <w:p>
+            <w:pPr>
+              <w:spacing w:after="20" w:before="20" w:line="280"/>
+              <w:jc w:val="left"/>
+            </w:pPr>
+            <w:r>
+              <w:rPr>
+                <w:rFonts w:ascii="Times New Roman" w:eastAsia="SimSun"/>
+                <w:b w:val="false"/>
+                <w:bCs w:val="false"/>
+                <w:color w:val="000000"/>
+                <w:sz w:val="21"/>
+                <w:szCs w:val="21"/>
+              </w:rPr>
+              <w:t xml:space="preserve">TCP:9000 收BER数据 + SSH/Jupyter 控制板</w:t>
+            </w:r>
+          </w:p>
+        </w:tc>
+      </w:tr>
+      <w:tr>
+        <w:trPr>
+          <w:cantSplit/>
+        </w:trPr>
+        <w:tc>
+          <w:tcPr>
+            <w:tcW w:type="pct" w:w="1200"/>
+            <w:shd w:fill="EDF3F5" w:val="clear"/>
+            <w:tcMar>
+              <w:top w:type="dxa" w:w="50"/>
+              <w:left w:type="dxa" w:w="100"/>
+              <w:bottom w:type="dxa" w:w="50"/>
+              <w:right w:type="dxa" w:w="100"/>
+            </w:tcMar>
+          </w:tcPr>
+          <w:p>
+            <w:pPr>
+              <w:spacing w:after="20" w:before="20" w:line="280"/>
+              <w:jc w:val="left"/>
+            </w:pPr>
+            <w:r>
+              <w:rPr>
+                <w:rFonts w:ascii="Times New Roman" w:eastAsia="SimSun"/>
+                <w:b w:val="false"/>
+                <w:bCs w:val="false"/>
+                <w:color w:val="000000"/>
+                <w:sz w:val="21"/>
+                <w:szCs w:val="21"/>
+              </w:rPr>
+              <w:t xml:space="preserve">PC ⇄ 板卡 USB串口</w:t>
+            </w:r>
+          </w:p>
+        </w:tc>
+        <w:tc>
+          <w:tcPr>
+            <w:tcW w:type="pct" w:w="1300"/>
+            <w:shd w:fill="EDF3F5" w:val="clear"/>
+            <w:tcMar>
+              <w:top w:type="dxa" w:w="50"/>
+              <w:left w:type="dxa" w:w="100"/>
+              <w:bottom w:type="dxa" w:w="50"/>
+              <w:right w:type="dxa" w:w="100"/>
+            </w:tcMar>
+          </w:tcPr>
+          <w:p>
+            <w:pPr>
+              <w:spacing w:after="20" w:before="20" w:line="280"/>
+              <w:jc w:val="left"/>
+            </w:pPr>
+            <w:r>
+              <w:rPr>
+                <w:rFonts w:ascii="Times New Roman" w:eastAsia="SimSun"/>
+                <w:b w:val="false"/>
+                <w:bCs w:val="false"/>
+                <w:color w:val="000000"/>
+                <w:sz w:val="21"/>
+                <w:szCs w:val="21"/>
+              </w:rPr>
+              <w:t xml:space="preserve">Micro USB线</w:t>
+            </w:r>
+          </w:p>
+        </w:tc>
+        <w:tc>
+          <w:tcPr>
+            <w:tcW w:type="pct" w:w="2500"/>
+            <w:shd w:fill="EDF3F5" w:val="clear"/>
+            <w:tcMar>
+              <w:top w:type="dxa" w:w="50"/>
+              <w:left w:type="dxa" w:w="100"/>
+              <w:bottom w:type="dxa" w:w="50"/>
+              <w:right w:type="dxa" w:w="100"/>
+            </w:tcMar>
+          </w:tcPr>
+          <w:p>
+            <w:pPr>
+              <w:spacing w:after="20" w:before="20" w:line="280"/>
+              <w:jc w:val="left"/>
+            </w:pPr>
+            <w:r>
+              <w:rPr>
+                <w:rFonts w:ascii="Times New Roman" w:eastAsia="SimSun"/>
+                <w:b w:val="false"/>
+                <w:bCs w:val="false"/>
+                <w:color w:val="000000"/>
+                <w:sz w:val="21"/>
+                <w:szCs w:val="21"/>
+              </w:rPr>
+              <w:t xml:space="preserve">Linux控制台(115200), 启动日志排障</w:t>
+            </w:r>
+          </w:p>
+        </w:tc>
+      </w:tr>
+      <w:tr>
+        <w:trPr>
+          <w:cantSplit/>
+        </w:trPr>
+        <w:tc>
+          <w:tcPr>
+            <w:tcW w:type="pct" w:w="1200"/>
+            <w:shd w:fill="FFFFFF" w:val="clear"/>
+            <w:tcMar>
+              <w:top w:type="dxa" w:w="50"/>
+              <w:left w:type="dxa" w:w="100"/>
+              <w:bottom w:type="dxa" w:w="50"/>
+              <w:right w:type="dxa" w:w="100"/>
+            </w:tcMar>
+          </w:tcPr>
+          <w:p>
+            <w:pPr>
+              <w:spacing w:after="20" w:before="20" w:line="280"/>
+              <w:jc w:val="left"/>
+            </w:pPr>
+            <w:r>
+              <w:rPr>
+                <w:rFonts w:ascii="Times New Roman" w:eastAsia="SimSun"/>
+                <w:b w:val="false"/>
+                <w:bCs w:val="false"/>
+                <w:color w:val="000000"/>
+                <w:sz w:val="21"/>
+                <w:szCs w:val="21"/>
+              </w:rPr>
+              <w:t xml:space="preserve">PC ⇄ 板卡 JTAG</w:t>
+            </w:r>
+          </w:p>
+        </w:tc>
+        <w:tc>
+          <w:tcPr>
+            <w:tcW w:type="pct" w:w="1300"/>
+            <w:shd w:fill="FFFFFF" w:val="clear"/>
+            <w:tcMar>
+              <w:top w:type="dxa" w:w="50"/>
+              <w:left w:type="dxa" w:w="100"/>
+              <w:bottom w:type="dxa" w:w="50"/>
+              <w:right w:type="dxa" w:w="100"/>
+            </w:tcMar>
+          </w:tcPr>
+          <w:p>
+            <w:pPr>
+              <w:spacing w:after="20" w:before="20" w:line="280"/>
+              <w:jc w:val="left"/>
+            </w:pPr>
+            <w:r>
+              <w:rPr>
+                <w:rFonts w:ascii="Times New Roman" w:eastAsia="SimSun"/>
+                <w:b w:val="false"/>
+                <w:bCs w:val="false"/>
+                <w:color w:val="000000"/>
+                <w:sz w:val="21"/>
+                <w:szCs w:val="21"/>
+              </w:rPr>
+              <w:t xml:space="preserve">Micro USB线</w:t>
+            </w:r>
+          </w:p>
+        </w:tc>
+        <w:tc>
+          <w:tcPr>
+            <w:tcW w:type="pct" w:w="2500"/>
+            <w:shd w:fill="FFFFFF" w:val="clear"/>
+            <w:tcMar>
+              <w:top w:type="dxa" w:w="50"/>
+              <w:left w:type="dxa" w:w="100"/>
+              <w:bottom w:type="dxa" w:w="50"/>
+              <w:right w:type="dxa" w:w="100"/>
+            </w:tcMar>
+          </w:tcPr>
+          <w:p>
+            <w:pPr>
+              <w:spacing w:after="20" w:before="20" w:line="280"/>
+              <w:jc w:val="left"/>
+            </w:pPr>
+            <w:r>
+              <w:rPr>
+                <w:rFonts w:ascii="Times New Roman" w:eastAsia="SimSun"/>
+                <w:b w:val="false"/>
+                <w:bCs w:val="false"/>
+                <w:color w:val="000000"/>
+                <w:sz w:val="21"/>
+                <w:szCs w:val="21"/>
+              </w:rPr>
+              <w:t xml:space="preserve">Vivado 下载 bit + 在线 ILA 调试</w:t>
+            </w:r>
+          </w:p>
+        </w:tc>
+      </w:tr>
+      <w:tr>
+        <w:trPr>
+          <w:cantSplit/>
+        </w:trPr>
+        <w:tc>
+          <w:tcPr>
+            <w:tcW w:type="pct" w:w="1200"/>
+            <w:shd w:fill="EDF3F5" w:val="clear"/>
+            <w:tcMar>
+              <w:top w:type="dxa" w:w="50"/>
+              <w:left w:type="dxa" w:w="100"/>
+              <w:bottom w:type="dxa" w:w="50"/>
+              <w:right w:type="dxa" w:w="100"/>
+            </w:tcMar>
+          </w:tcPr>
+          <w:p>
+            <w:pPr>
+              <w:spacing w:after="20" w:before="20" w:line="280"/>
+              <w:jc w:val="center"/>
+            </w:pPr>
+            <w:r>
+              <w:rPr>
+                <w:rFonts w:ascii="Times New Roman" w:eastAsia="SimSun"/>
+                <w:b w:val="false"/>
+                <w:bCs w:val="false"/>
+                <w:color w:val="000000"/>
+                <w:sz w:val="21"/>
+                <w:szCs w:val="21"/>
+              </w:rPr>
+              <w:t xml:space="preserve">12V 电源</w:t>
+            </w:r>
+          </w:p>
+        </w:tc>
+        <w:tc>
+          <w:tcPr>
+            <w:tcW w:type="pct" w:w="1300"/>
+            <w:shd w:fill="EDF3F5" w:val="clear"/>
+            <w:tcMar>
+              <w:top w:type="dxa" w:w="50"/>
+              <w:left w:type="dxa" w:w="100"/>
+              <w:bottom w:type="dxa" w:w="50"/>
+              <w:right w:type="dxa" w:w="100"/>
+            </w:tcMar>
+          </w:tcPr>
+          <w:p>
+            <w:pPr>
+              <w:spacing w:after="20" w:before="20" w:line="280"/>
+              <w:jc w:val="left"/>
+            </w:pPr>
+            <w:r>
+              <w:rPr>
+                <w:rFonts w:ascii="Times New Roman" w:eastAsia="SimSun"/>
+                <w:b w:val="false"/>
+                <w:bCs w:val="false"/>
+                <w:color w:val="000000"/>
+                <w:sz w:val="21"/>
+                <w:szCs w:val="21"/>
+              </w:rPr>
+              <w:t xml:space="preserve">适配器</w:t>
+            </w:r>
+          </w:p>
+        </w:tc>
+        <w:tc>
+          <w:tcPr>
+            <w:tcW w:type="pct" w:w="2500"/>
+            <w:shd w:fill="EDF3F5" w:val="clear"/>
+            <w:tcMar>
+              <w:top w:type="dxa" w:w="50"/>
+              <w:left w:type="dxa" w:w="100"/>
+              <w:bottom w:type="dxa" w:w="50"/>
+              <w:right w:type="dxa" w:w="100"/>
+            </w:tcMar>
+          </w:tcPr>
+          <w:p>
+            <w:pPr>
+              <w:spacing w:after="20" w:before="20" w:line="280"/>
+              <w:jc w:val="left"/>
+            </w:pPr>
+            <w:r>
+              <w:rPr>
+                <w:rFonts w:ascii="Times New Roman" w:eastAsia="SimSun"/>
+                <w:b w:val="false"/>
+                <w:bCs w:val="false"/>
+                <w:color w:val="000000"/>
+                <w:sz w:val="21"/>
+                <w:szCs w:val="21"/>
+              </w:rPr>
+              <w:t xml:space="preserve">最后接!</w:t>
+            </w:r>
+          </w:p>
+        </w:tc>
+      </w:tr>
+    </w:tbl>
+    <w:p>
+      <w:pPr>
+        <w:spacing w:after="100"/>
+      </w:pPr>
+    </w:p>
+    <w:p>
+      <w:pPr>
+        <w:pStyle w:val="Heading2"/>
+        <w:spacing w:after="140" w:before="300" w:line="340" w:lineRule="atLeast"/>
+      </w:pPr>
+      <w:bookmarkStart w:name="_Toc24" w:id="24"/>
+      <w:r>
+        <w:rPr>
+          <w:rFonts w:ascii="Times New Roman" w:eastAsia="SimHei"/>
+          <w:b/>
+          <w:bCs/>
+          <w:color w:val="0E2230"/>
+          <w:sz w:val="30"/>
+          <w:szCs w:val="30"/>
+        </w:rPr>
+        <w:t xml:space="preserve">5.3  启动流程（PYNQ-Z2 为例，照着做）</w:t>
+      </w:r>
+      <w:bookmarkEnd w:id="24"/>
+    </w:p>
+    <w:p>
+      <w:pPr>
+        <w:pStyle w:val="ListParagraph"/>
+        <w:numPr>
+          <w:ilvl w:val="0"/>
+          <w:numId w:val="1"/>
+        </w:numPr>
+        <w:spacing w:after="40" w:line="312"/>
+      </w:pPr>
+      <w:r>
+        <w:rPr>
+          <w:rFonts w:ascii="Times New Roman" w:eastAsia="SimSun"/>
+          <w:color w:val="000000"/>
+          <w:sz w:val="24"/>
+          <w:szCs w:val="24"/>
+        </w:rPr>
+        <w:t xml:space="preserve">制SD卡：下载 PYNQ 官方镜像(与Vivado版本匹配) → balenaEtcher 烧录到 ≥8G Class10 SD卡；</w:t>
+      </w:r>
+    </w:p>
+    <w:p>
+      <w:pPr>
+        <w:pStyle w:val="ListParagraph"/>
+        <w:numPr>
+          <w:ilvl w:val="0"/>
+          <w:numId w:val="1"/>
+        </w:numPr>
+        <w:spacing w:after="40" w:line="312"/>
+      </w:pPr>
+      <w:r>
+        <w:rPr>
+          <w:rFonts w:ascii="Times New Roman" w:eastAsia="SimSun"/>
+          <w:color w:val="000000"/>
+          <w:sz w:val="24"/>
+          <w:szCs w:val="24"/>
+        </w:rPr>
+        <w:t xml:space="preserve">启动跳线：板上 boot 跳线拨到 SD 挡（丝印标 010，JTAG 挡为 000——首次调试用 JTAG 挡）；</w:t>
+      </w:r>
+    </w:p>
+    <w:p>
+      <w:pPr>
+        <w:pStyle w:val="ListParagraph"/>
+        <w:numPr>
+          <w:ilvl w:val="0"/>
+          <w:numId w:val="1"/>
+        </w:numPr>
+        <w:spacing w:after="40" w:line="312"/>
+      </w:pPr>
+      <w:r>
+        <w:rPr>
+          <w:rFonts w:ascii="Times New Roman" w:eastAsia="SimSun"/>
+          <w:color w:val="000000"/>
+          <w:sz w:val="24"/>
+          <w:szCs w:val="24"/>
+        </w:rPr>
+        <w:t xml:space="preserve">连接顺序：网线 + USB串口 + 12V电源最后接；串口终端 115200 看启动日志；</w:t>
+      </w:r>
+    </w:p>
+    <w:p>
+      <w:pPr>
+        <w:pStyle w:val="ListParagraph"/>
+        <w:numPr>
+          <w:ilvl w:val="0"/>
+          <w:numId w:val="1"/>
+        </w:numPr>
+        <w:spacing w:after="40" w:line="312"/>
+      </w:pPr>
+      <w:r>
+        <w:rPr>
+          <w:rFonts w:ascii="Times New Roman" w:eastAsia="SimSun"/>
+          <w:color w:val="000000"/>
+          <w:sz w:val="24"/>
+          <w:szCs w:val="24"/>
+        </w:rPr>
+        <w:t xml:space="preserve">网络配置：PYNQ 默认 192.168.2.99——PC 网卡设同网段静态 IP(如 192.168.2.1)，浏览器登录 pynq.local；</w:t>
+      </w:r>
+    </w:p>
+    <w:p>
+      <w:pPr>
+        <w:pStyle w:val="ListParagraph"/>
+        <w:numPr>
+          <w:ilvl w:val="0"/>
+          <w:numId w:val="1"/>
+        </w:numPr>
+        <w:spacing w:after="40" w:line="312"/>
+      </w:pPr>
+      <w:r>
+        <w:rPr>
+          <w:rFonts w:ascii="Times New Roman" w:eastAsia="SimSun"/>
+          <w:color w:val="000000"/>
+          <w:sz w:val="24"/>
+          <w:szCs w:val="24"/>
+        </w:rPr>
+        <w:t xml:space="preserve">部署：Vivado Hardware Manager 下载 bit(PL)，scp 把 ber_server 传上板运行，PC 跑 ber_plot.py。</w:t>
+      </w:r>
+    </w:p>
+    <w:p>
+      <w:pPr>
+        <w:pStyle w:val="Heading2"/>
+        <w:spacing w:after="140" w:before="300" w:line="340" w:lineRule="atLeast"/>
+      </w:pPr>
+      <w:bookmarkStart w:name="_Toc25" w:id="25"/>
+      <w:r>
+        <w:rPr>
+          <w:rFonts w:ascii="Times New Roman" w:eastAsia="SimHei"/>
+          <w:b/>
+          <w:bCs/>
+          <w:color w:val="0E2230"/>
+          <w:sz w:val="30"/>
+          <w:szCs w:val="30"/>
+        </w:rPr>
+        <w:t xml:space="preserve">5.4  硬件坑</w:t>
+      </w:r>
+      <w:bookmarkEnd w:id="25"/>
+    </w:p>
+    <w:p>
+      <w:pPr>
+        <w:pStyle w:val="ListParagraph"/>
+        <w:numPr>
+          <w:ilvl w:val="0"/>
+          <w:numId w:val="1"/>
+        </w:numPr>
+        <w:spacing w:after="40" w:line="312"/>
+      </w:pPr>
+      <w:r>
+        <w:rPr>
+          <w:rFonts w:ascii="Times New Roman" w:eastAsia="SimSun"/>
+          <w:color w:val="000000"/>
+          <w:sz w:val="24"/>
+          <w:szCs w:val="24"/>
+        </w:rPr>
+        <w:t xml:space="preserve">EBAZ4205 没电源键：上电即跑矿机固件，需短接板上电阻改启动——买前搜改机教程；</w:t>
+      </w:r>
+    </w:p>
+    <w:p>
+      <w:pPr>
+        <w:pStyle w:val="ListParagraph"/>
+        <w:numPr>
+          <w:ilvl w:val="0"/>
+          <w:numId w:val="1"/>
+        </w:numPr>
+        <w:spacing w:after="40" w:line="312"/>
+      </w:pPr>
+      <w:r>
+        <w:rPr>
+          <w:rFonts w:ascii="Times New Roman" w:eastAsia="SimSun"/>
+          <w:color w:val="000000"/>
+          <w:sz w:val="24"/>
+          <w:szCs w:val="24"/>
+        </w:rPr>
+        <w:t xml:space="preserve">直连 PC 网口：两边都要设静态 IP 同网段，DHCP 环境下会拿不到 IP；</w:t>
+      </w:r>
+    </w:p>
+    <w:p>
+      <w:pPr>
+        <w:pStyle w:val="ListParagraph"/>
+        <w:numPr>
+          <w:ilvl w:val="0"/>
+          <w:numId w:val="1"/>
+        </w:numPr>
+        <w:spacing w:after="40" w:line="312"/>
+      </w:pPr>
+      <w:r>
+        <w:rPr>
+          <w:rFonts w:ascii="Times New Roman" w:eastAsia="SimSun"/>
+          <w:color w:val="000000"/>
+          <w:sz w:val="24"/>
+          <w:szCs w:val="24"/>
+        </w:rPr>
+        <w:t xml:space="preserve">串口乱码：确认 115200；仍是乱码检查 USB 转串口的驱动（CH340 需装驱动）；</w:t>
+      </w:r>
+    </w:p>
+    <w:p>
+      <w:pPr>
+        <w:pStyle w:val="ListParagraph"/>
+        <w:numPr>
+          <w:ilvl w:val="0"/>
+          <w:numId w:val="1"/>
+        </w:numPr>
+        <w:spacing w:after="40" w:line="312"/>
+      </w:pPr>
+      <w:r>
+        <w:rPr>
+          <w:rFonts w:ascii="Times New Roman" w:eastAsia="SimSun"/>
+          <w:color w:val="000000"/>
+          <w:sz w:val="24"/>
+          <w:szCs w:val="24"/>
+        </w:rPr>
+        <w:t xml:space="preserve">SD 镜像与 Vivado 版本不匹配会导致设备树/驱动异常——镜像和工具链版本对齐；</w:t>
+      </w:r>
+    </w:p>
+    <w:p>
+      <w:pPr>
+        <w:pStyle w:val="ListParagraph"/>
+        <w:numPr>
+          <w:ilvl w:val="0"/>
+          <w:numId w:val="1"/>
+        </w:numPr>
+        <w:spacing w:after="40" w:line="312"/>
+      </w:pPr>
+      <w:r>
+        <w:rPr>
+          <w:rFonts w:ascii="Times New Roman" w:eastAsia="SimSun"/>
+          <w:color w:val="000000"/>
+          <w:sz w:val="24"/>
+          <w:szCs w:val="24"/>
+        </w:rPr>
+        <w:t xml:space="preserve">JTAG 下载慢是正常（数 MB/s），别拔线；下载失败先检查跳线在 JTAG 挡。</w:t>
+      </w:r>
+    </w:p>
+    <w:p>
+      <w:pPr>
+        <w:pStyle w:val="Heading1"/>
+        <w:spacing w:after="200" w:before="400" w:line="360" w:lineRule="atLeast"/>
+        <w:jc w:val="center"/>
+      </w:pPr>
+      <w:bookmarkStart w:name="_Toc26" w:id="26"/>
+      <w:r>
+        <w:rPr>
+          <w:rFonts w:ascii="Times New Roman" w:eastAsia="SimHei"/>
+          <w:b/>
+          <w:bCs/>
+          <w:color w:val="0E2230"/>
+          <w:sz w:val="32"/>
+          <w:szCs w:val="32"/>
+        </w:rPr>
+        <w:t xml:space="preserve">第6章  Vivado 搭建步骤（照着点）</w:t>
+      </w:r>
+      <w:bookmarkEnd w:id="26"/>
+    </w:p>
+    <w:p>
+      <w:pPr>
+        <w:keepNext/>
+        <w:spacing w:after="80" w:before="160"/>
+        <w:jc w:val="center"/>
+      </w:pPr>
+      <w:r>
+        <w:rPr>
+          <w:rFonts w:ascii="Times New Roman" w:eastAsia="SimHei"/>
+          <w:b/>
+          <w:bCs/>
+          <w:color w:val="0E2230"/>
+          <w:sz w:val="21"/>
+          <w:szCs w:val="21"/>
+        </w:rPr>
+        <w:t xml:space="preserve">表6-1  工程搭建清单</w:t>
       </w:r>
     </w:p>
     <w:tbl>
@@ -15914,7 +17346,7 @@
         <w:pStyle w:val="Heading2"/>
         <w:spacing w:after="140" w:before="300" w:line="340" w:lineRule="atLeast"/>
       </w:pPr>
-      <w:bookmarkStart w:name="_Toc22" w:id="22"/>
+      <w:bookmarkStart w:name="_Toc27" w:id="27"/>
       <w:r>
         <w:rPr>
           <w:rFonts w:ascii="Times New Roman" w:eastAsia="SimHei"/>
@@ -15924,9 +17356,9 @@
           <w:sz w:val="30"/>
           <w:szCs w:val="30"/>
         </w:rPr>
-        <w:t xml:space="preserve">5.2  坑</w:t>
-      </w:r>
-      <w:bookmarkEnd w:id="22"/>
+        <w:t xml:space="preserve">6.2  坑</w:t>
+      </w:r>
+      <w:bookmarkEnd w:id="27"/>
     </w:p>
     <w:p>
       <w:pPr>
@@ -16010,7 +17442,7 @@
         <w:spacing w:after="200" w:before="400" w:line="360" w:lineRule="atLeast"/>
         <w:jc w:val="center"/>
       </w:pPr>
-      <w:bookmarkStart w:name="_Toc23" w:id="23"/>
+      <w:bookmarkStart w:name="_Toc28" w:id="28"/>
       <w:r>
         <w:rPr>
           <w:rFonts w:ascii="Times New Roman" w:eastAsia="SimHei"/>
@@ -16020,16 +17452,16 @@
           <w:sz w:val="32"/>
           <w:szCs w:val="32"/>
         </w:rPr>
-        <w:t xml:space="preserve">第6章  PS Linux 与 PC：BER 统计与曲线绘制</w:t>
-      </w:r>
-      <w:bookmarkEnd w:id="23"/>
+        <w:t xml:space="preserve">第7章  PS Linux 与 PC：BER 统计与曲线绘制</w:t>
+      </w:r>
+      <w:bookmarkEnd w:id="28"/>
     </w:p>
     <w:p>
       <w:pPr>
         <w:pStyle w:val="Heading2"/>
         <w:spacing w:after="140" w:before="300" w:line="340" w:lineRule="atLeast"/>
       </w:pPr>
-      <w:bookmarkStart w:name="_Toc24" w:id="24"/>
+      <w:bookmarkStart w:name="_Toc29" w:id="29"/>
       <w:r>
         <w:rPr>
           <w:rFonts w:ascii="Times New Roman" w:eastAsia="SimHei"/>
@@ -16039,9 +17471,9 @@
           <w:sz w:val="30"/>
           <w:szCs w:val="30"/>
         </w:rPr>
-        <w:t xml:space="preserve">6.1  寄存器映射与访问（/dev/uio0）</w:t>
-      </w:r>
-      <w:bookmarkEnd w:id="24"/>
+        <w:t xml:space="preserve">7.1  寄存器映射与访问（/dev/uio0）</w:t>
+      </w:r>
+      <w:bookmarkEnd w:id="29"/>
     </w:p>
     <w:p>
       <w:pPr>
@@ -16058,7 +17490,7 @@
           <w:sz w:val="21"/>
           <w:szCs w:val="21"/>
         </w:rPr>
-        <w:t xml:space="preserve">表6-1  PL 寄存器表（AXI-GPIO/BRAM, 基址 0x40000000）</w:t>
+        <w:t xml:space="preserve">表7-1  PL 寄存器表（AXI-GPIO/BRAM, 基址 0x40000000）</w:t>
       </w:r>
     </w:p>
     <w:tbl>
@@ -16751,7 +18183,7 @@
           <w:sz w:val="20"/>
           <w:szCs w:val="20"/>
         </w:rPr>
-        <w:t xml:space="preserve">清单6-1  ber_server.c（UIO+TCP:9000）</w:t>
+        <w:t xml:space="preserve">清单7-1  ber_server.c（UIO+TCP:9000）</w:t>
       </w:r>
     </w:p>
     <w:p>
@@ -18607,7 +20039,7 @@
         <w:pStyle w:val="Heading2"/>
         <w:spacing w:after="140" w:before="300" w:line="340" w:lineRule="atLeast"/>
       </w:pPr>
-      <w:bookmarkStart w:name="_Toc25" w:id="25"/>
+      <w:bookmarkStart w:name="_Toc30" w:id="30"/>
       <w:r>
         <w:rPr>
           <w:rFonts w:ascii="Times New Roman" w:eastAsia="SimHei"/>
@@ -18617,9 +20049,9 @@
           <w:sz w:val="30"/>
           <w:szCs w:val="30"/>
         </w:rPr>
-        <w:t xml:space="preserve">6.2  SNR 扫描闭环</w:t>
-      </w:r>
-      <w:bookmarkEnd w:id="25"/>
+        <w:t xml:space="preserve">7.2  SNR 扫描闭环</w:t>
+      </w:r>
+      <w:bookmarkEnd w:id="30"/>
     </w:p>
     <w:p>
       <w:pPr>
@@ -18656,7 +20088,7 @@
           <w:sz w:val="20"/>
           <w:szCs w:val="20"/>
         </w:rPr>
-        <w:t xml:space="preserve">清单6-2  ber_plot.py（PC端SNR扫描+绘图）</w:t>
+        <w:t xml:space="preserve">清单7-2  ber_plot.py（PC端SNR扫描+绘图）</w:t>
       </w:r>
     </w:p>
     <w:p>
@@ -19828,7 +21260,7 @@
         <w:pStyle w:val="Heading2"/>
         <w:spacing w:after="140" w:before="300" w:line="340" w:lineRule="atLeast"/>
       </w:pPr>
-      <w:bookmarkStart w:name="_Toc26" w:id="26"/>
+      <w:bookmarkStart w:name="_Toc31" w:id="31"/>
       <w:r>
         <w:rPr>
           <w:rFonts w:ascii="Times New Roman" w:eastAsia="SimHei"/>
@@ -19838,9 +21270,9 @@
           <w:sz w:val="30"/>
           <w:szCs w:val="30"/>
         </w:rPr>
-        <w:t xml:space="preserve">6.3  坑</w:t>
-      </w:r>
-      <w:bookmarkEnd w:id="26"/>
+        <w:t xml:space="preserve">7.3  坑</w:t>
+      </w:r>
+      <w:bookmarkEnd w:id="31"/>
     </w:p>
     <w:p>
       <w:pPr>
@@ -19905,7 +21337,7 @@
         <w:spacing w:after="200" w:before="400" w:line="360" w:lineRule="atLeast"/>
         <w:jc w:val="center"/>
       </w:pPr>
-      <w:bookmarkStart w:name="_Toc27" w:id="27"/>
+      <w:bookmarkStart w:name="_Toc32" w:id="32"/>
       <w:r>
         <w:rPr>
           <w:rFonts w:ascii="Times New Roman" w:eastAsia="SimHei"/>
@@ -19915,9 +21347,9 @@
           <w:sz w:val="32"/>
           <w:szCs w:val="32"/>
         </w:rPr>
-        <w:t xml:space="preserve">第7章  理论与答辩问答（8问）</w:t>
-      </w:r>
-      <w:bookmarkEnd w:id="27"/>
+        <w:t xml:space="preserve">第8章  理论与答辩问答（8问）</w:t>
+      </w:r>
+      <w:bookmarkEnd w:id="32"/>
     </w:p>
     <w:p>
       <w:pPr>
@@ -20197,7 +21629,7 @@
         <w:spacing w:after="200" w:before="400" w:line="360" w:lineRule="atLeast"/>
         <w:jc w:val="center"/>
       </w:pPr>
-      <w:bookmarkStart w:name="_Toc28" w:id="28"/>
+      <w:bookmarkStart w:name="_Toc33" w:id="33"/>
       <w:r>
         <w:rPr>
           <w:rFonts w:ascii="Times New Roman" w:eastAsia="SimHei"/>
@@ -20209,7 +21641,7 @@
         </w:rPr>
         <w:t xml:space="preserve">附录  文件清单与 IP 配置速查</w:t>
       </w:r>
-      <w:bookmarkEnd w:id="28"/>
+      <w:bookmarkEnd w:id="33"/>
     </w:p>
     <w:p>
       <w:pPr>

</xml_diff>